<commit_message>
update tugas modul 7
</commit_message>
<xml_diff>
--- a/06_Sekuensial_dan_Konkuren/Jurnal/Modul6_Jurnal_2311104024_TsaqifHisyamSaputra.docx
+++ b/06_Sekuensial_dan_Konkuren/Jurnal/Modul6_Jurnal_2311104024_TsaqifHisyamSaputra.docx
@@ -60,14 +60,7 @@
           <w:b/>
           <w:bCs/>
         </w:rPr>
-        <w:t>I</w:t>
-      </w:r>
-      <w:r>
-        <w:rPr>
-          <w:b/>
-          <w:bCs/>
-        </w:rPr>
-        <w:t>V</w:t>
+        <w:t>VI</w:t>
       </w:r>
     </w:p>
     <w:p>
@@ -1115,7 +1108,6 @@
         <w:tblCellMar>
           <w:top w:w="47" w:type="dxa"/>
           <w:left w:w="108" w:type="dxa"/>
-          <w:bottom w:w="0" w:type="dxa"/>
           <w:right w:w="115" w:type="dxa"/>
         </w:tblCellMar>
         <w:tblLook w:val="04A0" w:firstRow="1" w:lastRow="0" w:firstColumn="1" w:lastColumn="0" w:noHBand="0" w:noVBand="1"/>
@@ -1454,6 +1446,9 @@
         <w:ind w:left="1080" w:firstLine="0"/>
       </w:pPr>
       <w:r>
+        <w:rPr>
+          <w:noProof/>
+        </w:rPr>
         <w:drawing>
           <wp:inline distT="0" distB="0" distL="0" distR="0" wp14:anchorId="1B02B3EB" wp14:editId="02364F81">
             <wp:extent cx="3785723" cy="1014892"/>
@@ -1565,6 +1560,9 @@
         <w:ind w:left="1080" w:firstLine="0"/>
       </w:pPr>
       <w:r>
+        <w:rPr>
+          <w:noProof/>
+        </w:rPr>
         <w:drawing>
           <wp:inline distT="0" distB="0" distL="0" distR="0" wp14:anchorId="6C425236" wp14:editId="59777C48">
             <wp:extent cx="3803503" cy="649835"/>
@@ -1680,6 +1678,9 @@
         <w:ind w:left="1080" w:firstLine="0"/>
       </w:pPr>
       <w:r>
+        <w:rPr>
+          <w:noProof/>
+        </w:rPr>
         <w:drawing>
           <wp:inline distT="0" distB="0" distL="0" distR="0" wp14:anchorId="7718571A" wp14:editId="7A09073F">
             <wp:extent cx="3994455" cy="304800"/>
@@ -1773,6 +1774,9 @@
         <w:ind w:left="1080" w:firstLine="0"/>
       </w:pPr>
       <w:r>
+        <w:rPr>
+          <w:noProof/>
+        </w:rPr>
         <w:drawing>
           <wp:inline distT="0" distB="0" distL="0" distR="0" wp14:anchorId="6E9D0EA6" wp14:editId="57E21E37">
             <wp:extent cx="2202229" cy="2625310"/>
@@ -3667,6 +3671,7 @@
   <w:style w:type="character" w:default="1" w:styleId="DefaultParagraphFont">
     <w:name w:val="Default Paragraph Font"/>
     <w:uiPriority w:val="1"/>
+    <w:semiHidden/>
     <w:unhideWhenUsed/>
   </w:style>
   <w:style w:type="table" w:default="1" w:styleId="TableNormal">

</xml_diff>